<commit_message>
fix(report_export): improve DOCX pagination and update templates
- Add keep_unit_together option to keep related report units on one page
- Propagate keep-together settings through section content helpers
- Regenerate defence_analysis.docx/pdf templates
- Ignore Python 3.11 venv (.venv311/)
</commit_message>
<xml_diff>
--- a/data/templates/defence_analysis.docx
+++ b/data/templates/defence_analysis.docx
@@ -125,11 +125,6 @@
       </w:pPr>
     </w:p>
     <w:p>
-      <w:r>
-        <w:br w:type="page"/>
-      </w:r>
-    </w:p>
-    <w:p>
       <w:pPr>
         <w:pStyle w:val="Heading1"/>
       </w:pPr>
@@ -204,11 +199,6 @@
       </w:r>
     </w:p>
     <w:p>
-      <w:r>
-        <w:br w:type="page"/>
-      </w:r>
-    </w:p>
-    <w:p>
       <w:pPr>
         <w:pStyle w:val="Heading1"/>
       </w:pPr>
@@ -270,39 +260,10 @@
     </w:p>
     <w:p>
       <w:pPr>
-        <w:spacing w:after="160" w:line="278" w:lineRule="auto"/>
-        <w:rPr>
-          <w:b/>
-          <w:color w:val="2C3E50"/>
-          <w:sz w:val="32"/>
-        </w:rPr>
-      </w:pPr>
-      <w:r>
-        <w:rPr>
-          <w:color w:val="2C3E50"/>
-          <w:sz w:val="32"/>
-        </w:rPr>
-        <w:br w:type="page"/>
-      </w:r>
-    </w:p>
-    <w:p>
-      <w:pPr>
         <w:pStyle w:val="Heading1"/>
       </w:pPr>
       <w:r>
-        <w:rPr>
-          <w:color w:val="2C3E50"/>
-          <w:sz w:val="32"/>
-        </w:rPr>
-        <w:lastRenderedPageBreak/>
-        <w:t>4</w:t>
-      </w:r>
-      <w:r>
-        <w:rPr>
-          <w:color w:val="2C3E50"/>
-          <w:sz w:val="32"/>
-        </w:rPr>
-        <w:t>. SUMMARY OF EVIDENCE</w:t>
+        <w:t>3. SUMMARY OF EVIDENCE</w:t>
       </w:r>
     </w:p>
     <w:p>
@@ -339,32 +300,7 @@
         <w:pStyle w:val="Heading1"/>
       </w:pPr>
       <w:r>
-        <w:rPr>
-          <w:color w:val="2C3E50"/>
-          <w:sz w:val="32"/>
-        </w:rPr>
-        <w:t>5. A</w:t>
-      </w:r>
-      <w:r>
-        <w:rPr>
-          <w:color w:val="2C3E50"/>
-          <w:sz w:val="32"/>
-        </w:rPr>
-        <w:t>S</w:t>
-      </w:r>
-      <w:r>
-        <w:rPr>
-          <w:color w:val="2C3E50"/>
-          <w:sz w:val="32"/>
-        </w:rPr>
-        <w:t>S</w:t>
-      </w:r>
-      <w:r>
-        <w:rPr>
-          <w:color w:val="2C3E50"/>
-          <w:sz w:val="32"/>
-        </w:rPr>
-        <w:t>ESSMENT OF PROSECUTION CASE</w:t>
+        <w:t>4. ASSESSMENT OF PROSECUTION CASE</w:t>
       </w:r>
     </w:p>
     <w:p>
@@ -463,19 +399,7 @@
         <w:pStyle w:val="Heading1"/>
       </w:pPr>
       <w:r>
-        <w:rPr>
-          <w:color w:val="2C3E50"/>
-          <w:sz w:val="32"/>
-        </w:rPr>
-        <w:lastRenderedPageBreak/>
-        <w:t>6</w:t>
-      </w:r>
-      <w:r>
-        <w:rPr>
-          <w:color w:val="2C3E50"/>
-          <w:sz w:val="32"/>
-        </w:rPr>
-        <w:t>. EVIDENCE ANALYSIS</w:t>
+        <w:t>5. EVIDENCE ANALYSIS</w:t>
       </w:r>
     </w:p>
     <w:p>
@@ -527,22 +451,9 @@
     </w:p>
     <w:p>
       <w:pPr>
-        <w:spacing w:after="160" w:line="278" w:lineRule="auto"/>
-      </w:pPr>
-      <w:r>
-        <w:br w:type="page"/>
-      </w:r>
-    </w:p>
-    <w:p>
-      <w:pPr>
         <w:pStyle w:val="Heading1"/>
       </w:pPr>
       <w:r>
-        <w:rPr>
-          <w:color w:val="2C3E50"/>
-          <w:sz w:val="32"/>
-        </w:rPr>
-        <w:lastRenderedPageBreak/>
         <w:t>6. ELEMENTS THE PROSECUTION MUST PROVE</w:t>
       </w:r>
     </w:p>
@@ -645,10 +556,6 @@
         <w:pStyle w:val="Heading1"/>
       </w:pPr>
       <w:r>
-        <w:rPr>
-          <w:color w:val="2C3E50"/>
-          <w:sz w:val="32"/>
-        </w:rPr>
         <w:t>7. DEFENCE STRATEGIES AND OPTIONS</w:t>
       </w:r>
     </w:p>
@@ -758,7 +665,6 @@
         <w:rPr>
           <w:b/>
         </w:rPr>
-        <w:lastRenderedPageBreak/>
         <w:t>Legal Basis:</w:t>
       </w:r>
       <w:r>
@@ -821,10 +727,6 @@
         <w:pStyle w:val="Heading1"/>
       </w:pPr>
       <w:r>
-        <w:rPr>
-          <w:color w:val="2C3E50"/>
-          <w:sz w:val="32"/>
-        </w:rPr>
         <w:t>8. CROSS-EXAMINATION PRIORITIES</w:t>
       </w:r>
     </w:p>
@@ -897,22 +799,9 @@
     </w:p>
     <w:p>
       <w:pPr>
-        <w:spacing w:after="160" w:line="278" w:lineRule="auto"/>
-      </w:pPr>
-      <w:r>
-        <w:br w:type="page"/>
-      </w:r>
-    </w:p>
-    <w:p>
-      <w:pPr>
         <w:pStyle w:val="Heading1"/>
       </w:pPr>
       <w:r>
-        <w:rPr>
-          <w:color w:val="2C3E50"/>
-          <w:sz w:val="32"/>
-        </w:rPr>
-        <w:lastRenderedPageBreak/>
         <w:t>9. DISCLOSURE AND FORENSIC GAPS</w:t>
       </w:r>
     </w:p>
@@ -1042,22 +931,9 @@
     </w:p>
     <w:p>
       <w:pPr>
-        <w:spacing w:after="160" w:line="278" w:lineRule="auto"/>
-      </w:pPr>
-      <w:r>
-        <w:br w:type="page"/>
-      </w:r>
-    </w:p>
-    <w:p>
-      <w:pPr>
         <w:pStyle w:val="Heading1"/>
       </w:pPr>
       <w:r>
-        <w:rPr>
-          <w:color w:val="2C3E50"/>
-          <w:sz w:val="32"/>
-        </w:rPr>
-        <w:lastRenderedPageBreak/>
         <w:t>10. INSTRUCTIONS TO COUNSEL PRE-TRIAL</w:t>
       </w:r>
     </w:p>
@@ -1104,10 +980,6 @@
         <w:pStyle w:val="Heading1"/>
       </w:pPr>
       <w:r>
-        <w:rPr>
-          <w:color w:val="2C3E50"/>
-          <w:sz w:val="32"/>
-        </w:rPr>
         <w:t>11. EVIDENTIARY ISSUES TO RAISE</w:t>
       </w:r>
     </w:p>
@@ -1200,28 +1072,9 @@
     </w:p>
     <w:p>
       <w:pPr>
-        <w:spacing w:after="160" w:line="278" w:lineRule="auto"/>
-        <w:rPr>
-          <w:b/>
-        </w:rPr>
-      </w:pPr>
-      <w:r>
-        <w:rPr>
-          <w:b/>
-        </w:rPr>
-        <w:br w:type="page"/>
-      </w:r>
-    </w:p>
-    <w:p>
-      <w:pPr>
         <w:pStyle w:val="Heading1"/>
       </w:pPr>
       <w:r>
-        <w:rPr>
-          <w:color w:val="2C3E50"/>
-          <w:sz w:val="32"/>
-        </w:rPr>
-        <w:lastRenderedPageBreak/>
         <w:t>12. CONCLUSION</w:t>
       </w:r>
     </w:p>

</xml_diff>